<commit_message>
crop advisor complete - ML model, dual-mode recommendation, updated gitignore and README
</commit_message>
<xml_diff>
--- a/plan.docx
+++ b/plan.docx
@@ -4,475 +4,8 @@
   <w:body>
     <w:p>
       <w:r>
-        <w:t>Perfect. Advanced + Windows. Let's build this properly.</w:t>
-      </w:r>
-    </w:p>
-    <w:p>
-      <w:r>
-        <w:pict w14:anchorId="455D60E6">
-          <v:rect id="_x0000_i1073" style="width:0;height:1.5pt" o:hralign="center" o:hrstd="t" o:hr="t" fillcolor="#a0a0a0" stroked="f"/>
-        </w:pict>
-      </w:r>
-    </w:p>
-    <w:p>
-      <w:pPr>
-        <w:rPr>
-          <w:b/>
-          <w:bCs/>
-        </w:rPr>
-      </w:pPr>
-      <w:r>
-        <w:rPr>
-          <w:b/>
-          <w:bCs/>
-        </w:rPr>
-        <w:t>KrushiAI — Full Implementation Plan</w:t>
-      </w:r>
-    </w:p>
-    <w:p>
-      <w:pPr>
-        <w:rPr>
-          <w:b/>
-          <w:bCs/>
-        </w:rPr>
-      </w:pPr>
-      <w:r>
-        <w:rPr>
-          <w:b/>
-          <w:bCs/>
-        </w:rPr>
-        <w:t>Project Structure</w:t>
-      </w:r>
-    </w:p>
-    <w:p>
-      <w:r>
-        <w:t>krushiai/</w:t>
-      </w:r>
-    </w:p>
-    <w:p>
-      <w:r>
-        <w:rPr>
-          <w:rFonts w:ascii="MS Gothic" w:eastAsia="MS Gothic" w:hAnsi="MS Gothic" w:cs="MS Gothic" w:hint="eastAsia"/>
-        </w:rPr>
-        <w:t>├</w:t>
-      </w:r>
-      <w:r>
-        <w:rPr>
-          <w:rFonts w:ascii="Calibri" w:hAnsi="Calibri" w:cs="Calibri"/>
-        </w:rPr>
-        <w:t>──</w:t>
-      </w:r>
-      <w:r>
-        <w:t xml:space="preserve"> backend/</w:t>
-      </w:r>
-    </w:p>
-    <w:p>
-      <w:r>
-        <w:t xml:space="preserve">│   </w:t>
-      </w:r>
-      <w:r>
-        <w:rPr>
-          <w:rFonts w:ascii="MS Gothic" w:eastAsia="MS Gothic" w:hAnsi="MS Gothic" w:cs="MS Gothic" w:hint="eastAsia"/>
-        </w:rPr>
-        <w:t>├</w:t>
-      </w:r>
-      <w:r>
-        <w:rPr>
-          <w:rFonts w:ascii="Calibri" w:hAnsi="Calibri" w:cs="Calibri"/>
-        </w:rPr>
-        <w:t>──</w:t>
-      </w:r>
-      <w:r>
-        <w:t xml:space="preserve"> main.py                  # FastAPI app entry point</w:t>
-      </w:r>
-    </w:p>
-    <w:p>
-      <w:r>
-        <w:t xml:space="preserve">│   </w:t>
-      </w:r>
-      <w:r>
-        <w:rPr>
-          <w:rFonts w:ascii="MS Gothic" w:eastAsia="MS Gothic" w:hAnsi="MS Gothic" w:cs="MS Gothic" w:hint="eastAsia"/>
-        </w:rPr>
-        <w:t>├</w:t>
-      </w:r>
-      <w:r>
-        <w:rPr>
-          <w:rFonts w:ascii="Calibri" w:hAnsi="Calibri" w:cs="Calibri"/>
-        </w:rPr>
-        <w:t>──</w:t>
-      </w:r>
-      <w:r>
-        <w:t xml:space="preserve"> routes/</w:t>
-      </w:r>
-    </w:p>
-    <w:p>
-      <w:r>
-        <w:t xml:space="preserve">│   │   </w:t>
-      </w:r>
-      <w:r>
-        <w:rPr>
-          <w:rFonts w:ascii="MS Gothic" w:eastAsia="MS Gothic" w:hAnsi="MS Gothic" w:cs="MS Gothic" w:hint="eastAsia"/>
-        </w:rPr>
-        <w:t>├</w:t>
-      </w:r>
-      <w:r>
-        <w:rPr>
-          <w:rFonts w:ascii="Calibri" w:hAnsi="Calibri" w:cs="Calibri"/>
-        </w:rPr>
-        <w:t>──</w:t>
-      </w:r>
-      <w:r>
-        <w:t xml:space="preserve"> crop.py              # Crop recommendation</w:t>
-      </w:r>
-    </w:p>
-    <w:p>
-      <w:r>
-        <w:t xml:space="preserve">│   │   </w:t>
-      </w:r>
-      <w:r>
-        <w:rPr>
-          <w:rFonts w:ascii="MS Gothic" w:eastAsia="MS Gothic" w:hAnsi="MS Gothic" w:cs="MS Gothic" w:hint="eastAsia"/>
-        </w:rPr>
-        <w:t>├</w:t>
-      </w:r>
-      <w:r>
-        <w:rPr>
-          <w:rFonts w:ascii="Calibri" w:hAnsi="Calibri" w:cs="Calibri"/>
-        </w:rPr>
-        <w:t>──</w:t>
-      </w:r>
-      <w:r>
-        <w:t xml:space="preserve"> pest.py              # Pest detection</w:t>
-      </w:r>
-    </w:p>
-    <w:p>
-      <w:r>
-        <w:t xml:space="preserve">│   │   </w:t>
-      </w:r>
-      <w:r>
-        <w:rPr>
-          <w:rFonts w:ascii="MS Gothic" w:eastAsia="MS Gothic" w:hAnsi="MS Gothic" w:cs="MS Gothic" w:hint="eastAsia"/>
-        </w:rPr>
-        <w:t>├</w:t>
-      </w:r>
-      <w:r>
-        <w:rPr>
-          <w:rFonts w:ascii="Calibri" w:hAnsi="Calibri" w:cs="Calibri"/>
-        </w:rPr>
-        <w:t>──</w:t>
-      </w:r>
-      <w:r>
-        <w:t xml:space="preserve"> market.py            # Price prediction</w:t>
-      </w:r>
-    </w:p>
-    <w:p>
-      <w:r>
-        <w:t>│   │   └── irrigation.py        # Irrigation advisor</w:t>
-      </w:r>
-    </w:p>
-    <w:p>
-      <w:r>
-        <w:t xml:space="preserve">│   </w:t>
-      </w:r>
-      <w:r>
-        <w:rPr>
-          <w:rFonts w:ascii="MS Gothic" w:eastAsia="MS Gothic" w:hAnsi="MS Gothic" w:cs="MS Gothic" w:hint="eastAsia"/>
-        </w:rPr>
-        <w:t>├</w:t>
-      </w:r>
-      <w:r>
-        <w:rPr>
-          <w:rFonts w:ascii="Calibri" w:hAnsi="Calibri" w:cs="Calibri"/>
-        </w:rPr>
-        <w:t>──</w:t>
-      </w:r>
-      <w:r>
-        <w:t xml:space="preserve"> models/</w:t>
-      </w:r>
-    </w:p>
-    <w:p>
-      <w:r>
-        <w:t xml:space="preserve">│   │   </w:t>
-      </w:r>
-      <w:r>
-        <w:rPr>
-          <w:rFonts w:ascii="MS Gothic" w:eastAsia="MS Gothic" w:hAnsi="MS Gothic" w:cs="MS Gothic" w:hint="eastAsia"/>
-        </w:rPr>
-        <w:t>├</w:t>
-      </w:r>
-      <w:r>
-        <w:rPr>
-          <w:rFonts w:ascii="Calibri" w:hAnsi="Calibri" w:cs="Calibri"/>
-        </w:rPr>
-        <w:t>──</w:t>
-      </w:r>
-      <w:r>
-        <w:t xml:space="preserve"> pest_model/          # Downloaded HuggingFace model</w:t>
-      </w:r>
-    </w:p>
-    <w:p>
-      <w:r>
-        <w:t>│   │   └── market_model.pkl     # Trained scikit-learn model</w:t>
-      </w:r>
-    </w:p>
-    <w:p>
-      <w:r>
-        <w:t xml:space="preserve">│   </w:t>
-      </w:r>
-      <w:r>
-        <w:rPr>
-          <w:rFonts w:ascii="MS Gothic" w:eastAsia="MS Gothic" w:hAnsi="MS Gothic" w:cs="MS Gothic" w:hint="eastAsia"/>
-        </w:rPr>
-        <w:t>├</w:t>
-      </w:r>
-      <w:r>
-        <w:rPr>
-          <w:rFonts w:ascii="Calibri" w:hAnsi="Calibri" w:cs="Calibri"/>
-        </w:rPr>
-        <w:t>──</w:t>
-      </w:r>
-      <w:r>
-        <w:t xml:space="preserve"> data/</w:t>
-      </w:r>
-    </w:p>
-    <w:p>
-      <w:r>
-        <w:t xml:space="preserve">│   │   </w:t>
-      </w:r>
-      <w:r>
-        <w:rPr>
-          <w:rFonts w:ascii="MS Gothic" w:eastAsia="MS Gothic" w:hAnsi="MS Gothic" w:cs="MS Gothic" w:hint="eastAsia"/>
-        </w:rPr>
-        <w:t>├</w:t>
-      </w:r>
-      <w:r>
-        <w:rPr>
-          <w:rFonts w:ascii="Calibri" w:hAnsi="Calibri" w:cs="Calibri"/>
-        </w:rPr>
-        <w:t>──</w:t>
-      </w:r>
-      <w:r>
-        <w:t xml:space="preserve"> crop_prices.csv      # Historical price data</w:t>
-      </w:r>
-    </w:p>
-    <w:p>
-      <w:r>
-        <w:t>│   │   └── crop_soil_map.json   # Crop-soil-climate mapping</w:t>
-      </w:r>
-    </w:p>
-    <w:p>
-      <w:r>
-        <w:t xml:space="preserve">│   </w:t>
-      </w:r>
-      <w:r>
-        <w:rPr>
-          <w:rFonts w:ascii="MS Gothic" w:eastAsia="MS Gothic" w:hAnsi="MS Gothic" w:cs="MS Gothic" w:hint="eastAsia"/>
-        </w:rPr>
-        <w:t>├</w:t>
-      </w:r>
-      <w:r>
-        <w:rPr>
-          <w:rFonts w:ascii="Calibri" w:hAnsi="Calibri" w:cs="Calibri"/>
-        </w:rPr>
-        <w:t>──</w:t>
-      </w:r>
-      <w:r>
-        <w:t xml:space="preserve"> db/</w:t>
-      </w:r>
-    </w:p>
-    <w:p>
-      <w:r>
-        <w:t>│   │   └── krushiai.db          # SQLite database</w:t>
-      </w:r>
-    </w:p>
-    <w:p>
-      <w:r>
-        <w:t>│   └── requirements.txt</w:t>
-      </w:r>
-    </w:p>
-    <w:p>
-      <w:r>
-        <w:rPr>
-          <w:rFonts w:ascii="MS Gothic" w:eastAsia="MS Gothic" w:hAnsi="MS Gothic" w:cs="MS Gothic" w:hint="eastAsia"/>
-        </w:rPr>
-        <w:t>├</w:t>
-      </w:r>
-      <w:r>
-        <w:rPr>
-          <w:rFonts w:ascii="Calibri" w:hAnsi="Calibri" w:cs="Calibri"/>
-        </w:rPr>
-        <w:t>──</w:t>
-      </w:r>
-      <w:r>
-        <w:t xml:space="preserve"> frontend/</w:t>
-      </w:r>
-    </w:p>
-    <w:p>
-      <w:r>
-        <w:t xml:space="preserve">│   </w:t>
-      </w:r>
-      <w:r>
-        <w:rPr>
-          <w:rFonts w:ascii="MS Gothic" w:eastAsia="MS Gothic" w:hAnsi="MS Gothic" w:cs="MS Gothic" w:hint="eastAsia"/>
-        </w:rPr>
-        <w:t>├</w:t>
-      </w:r>
-      <w:r>
-        <w:rPr>
-          <w:rFonts w:ascii="Calibri" w:hAnsi="Calibri" w:cs="Calibri"/>
-        </w:rPr>
-        <w:t>──</w:t>
-      </w:r>
-      <w:r>
-        <w:t xml:space="preserve"> src/</w:t>
-      </w:r>
-    </w:p>
-    <w:p>
-      <w:r>
-        <w:t xml:space="preserve">│   │   </w:t>
-      </w:r>
-      <w:r>
-        <w:rPr>
-          <w:rFonts w:ascii="MS Gothic" w:eastAsia="MS Gothic" w:hAnsi="MS Gothic" w:cs="MS Gothic" w:hint="eastAsia"/>
-        </w:rPr>
-        <w:t>├</w:t>
-      </w:r>
-      <w:r>
-        <w:rPr>
-          <w:rFonts w:ascii="Calibri" w:hAnsi="Calibri" w:cs="Calibri"/>
-        </w:rPr>
-        <w:t>──</w:t>
-      </w:r>
-      <w:r>
-        <w:t xml:space="preserve"> pages/</w:t>
-      </w:r>
-    </w:p>
-    <w:p>
-      <w:r>
-        <w:t xml:space="preserve">│   │   │   </w:t>
-      </w:r>
-      <w:r>
-        <w:rPr>
-          <w:rFonts w:ascii="MS Gothic" w:eastAsia="MS Gothic" w:hAnsi="MS Gothic" w:cs="MS Gothic" w:hint="eastAsia"/>
-        </w:rPr>
-        <w:t>├</w:t>
-      </w:r>
-      <w:r>
-        <w:rPr>
-          <w:rFonts w:ascii="Calibri" w:hAnsi="Calibri" w:cs="Calibri"/>
-        </w:rPr>
-        <w:t>──</w:t>
-      </w:r>
-      <w:r>
-        <w:t xml:space="preserve"> Dashboard.jsx</w:t>
-      </w:r>
-    </w:p>
-    <w:p>
-      <w:r>
-        <w:t xml:space="preserve">│   │   │   </w:t>
-      </w:r>
-      <w:r>
-        <w:rPr>
-          <w:rFonts w:ascii="MS Gothic" w:eastAsia="MS Gothic" w:hAnsi="MS Gothic" w:cs="MS Gothic" w:hint="eastAsia"/>
-        </w:rPr>
-        <w:t>├</w:t>
-      </w:r>
-      <w:r>
-        <w:rPr>
-          <w:rFonts w:ascii="Calibri" w:hAnsi="Calibri" w:cs="Calibri"/>
-        </w:rPr>
-        <w:t>──</w:t>
-      </w:r>
-      <w:r>
-        <w:t xml:space="preserve"> CropAdvisor.jsx</w:t>
-      </w:r>
-    </w:p>
-    <w:p>
-      <w:r>
-        <w:t xml:space="preserve">│   │   │   </w:t>
-      </w:r>
-      <w:r>
-        <w:rPr>
-          <w:rFonts w:ascii="MS Gothic" w:eastAsia="MS Gothic" w:hAnsi="MS Gothic" w:cs="MS Gothic" w:hint="eastAsia"/>
-        </w:rPr>
-        <w:t>├</w:t>
-      </w:r>
-      <w:r>
-        <w:rPr>
-          <w:rFonts w:ascii="Calibri" w:hAnsi="Calibri" w:cs="Calibri"/>
-        </w:rPr>
-        <w:t>──</w:t>
-      </w:r>
-      <w:r>
-        <w:t xml:space="preserve"> PestDetection.jsx</w:t>
-      </w:r>
-    </w:p>
-    <w:p>
-      <w:r>
-        <w:t xml:space="preserve">│   │   │   </w:t>
-      </w:r>
-      <w:r>
-        <w:rPr>
-          <w:rFonts w:ascii="MS Gothic" w:eastAsia="MS Gothic" w:hAnsi="MS Gothic" w:cs="MS Gothic" w:hint="eastAsia"/>
-        </w:rPr>
-        <w:t>├</w:t>
-      </w:r>
-      <w:r>
-        <w:rPr>
-          <w:rFonts w:ascii="Calibri" w:hAnsi="Calibri" w:cs="Calibri"/>
-        </w:rPr>
-        <w:t>──</w:t>
-      </w:r>
-      <w:r>
-        <w:t xml:space="preserve"> MarketPredictor.jsx</w:t>
-      </w:r>
-    </w:p>
-    <w:p>
-      <w:r>
-        <w:t>│   │   │   └── Irrigation.jsx</w:t>
-      </w:r>
-    </w:p>
-    <w:p>
-      <w:r>
-        <w:t xml:space="preserve">│   │   </w:t>
-      </w:r>
-      <w:r>
-        <w:rPr>
-          <w:rFonts w:ascii="MS Gothic" w:eastAsia="MS Gothic" w:hAnsi="MS Gothic" w:cs="MS Gothic" w:hint="eastAsia"/>
-        </w:rPr>
-        <w:t>├</w:t>
-      </w:r>
-      <w:r>
-        <w:rPr>
-          <w:rFonts w:ascii="Calibri" w:hAnsi="Calibri" w:cs="Calibri"/>
-        </w:rPr>
-        <w:t>──</w:t>
-      </w:r>
-      <w:r>
-        <w:t xml:space="preserve"> components/</w:t>
-      </w:r>
-    </w:p>
-    <w:p>
-      <w:r>
-        <w:lastRenderedPageBreak/>
-        <w:t>│   │   └── App.jsx</w:t>
-      </w:r>
-    </w:p>
-    <w:p>
-      <w:r>
-        <w:t>│   └── package.json</w:t>
-      </w:r>
-    </w:p>
-    <w:p>
-      <w:r>
-        <w:t>└── README.md</w:t>
-      </w:r>
-    </w:p>
-    <w:p>
-      <w:r>
         <w:pict w14:anchorId="2A5B3CB6">
-          <v:rect id="_x0000_i1074" style="width:0;height:1.5pt" o:hralign="center" o:hrstd="t" o:hr="t" fillcolor="#a0a0a0" stroked="f"/>
+          <v:rect id="_x0000_i1026" style="width:0;height:1.5pt" o:hralign="center" o:hrstd="t" o:hr="t" fillcolor="#a0a0a0" stroked="f"/>
         </w:pict>
       </w:r>
     </w:p>
@@ -494,7 +27,7 @@
     <w:p>
       <w:r>
         <w:pict w14:anchorId="0934CDD7">
-          <v:rect id="_x0000_i1075" style="width:0;height:1.5pt" o:hralign="center" o:hrstd="t" o:hr="t" fillcolor="#a0a0a0" stroked="f"/>
+          <v:rect id="_x0000_i1027" style="width:0;height:1.5pt" o:hralign="center" o:hrstd="t" o:hr="t" fillcolor="#a0a0a0" stroked="f"/>
         </w:pict>
       </w:r>
     </w:p>
@@ -541,8 +74,21 @@
         </w:numPr>
       </w:pPr>
       <w:r>
-        <w:t>Create virtual environment: python -m venv venv</w:t>
-      </w:r>
+        <w:t xml:space="preserve">Create virtual environment: python -m </w:t>
+      </w:r>
+      <w:proofErr w:type="spellStart"/>
+      <w:r>
+        <w:t>venv</w:t>
+      </w:r>
+      <w:proofErr w:type="spellEnd"/>
+      <w:r>
+        <w:t xml:space="preserve"> </w:t>
+      </w:r>
+      <w:proofErr w:type="spellStart"/>
+      <w:r>
+        <w:t>venv</w:t>
+      </w:r>
+      <w:proofErr w:type="spellEnd"/>
     </w:p>
     <w:p>
       <w:pPr>
@@ -552,7 +98,23 @@
         </w:numPr>
       </w:pPr>
       <w:r>
-        <w:t>Install backend deps: fastapi, uvicorn, pillow, transformers, torch, sqlite3</w:t>
+        <w:t xml:space="preserve">Install backend deps: </w:t>
+      </w:r>
+      <w:proofErr w:type="spellStart"/>
+      <w:r>
+        <w:t>fastapi</w:t>
+      </w:r>
+      <w:proofErr w:type="spellEnd"/>
+      <w:r>
+        <w:t xml:space="preserve">, </w:t>
+      </w:r>
+      <w:proofErr w:type="spellStart"/>
+      <w:r>
+        <w:t>uvicorn</w:t>
+      </w:r>
+      <w:proofErr w:type="spellEnd"/>
+      <w:r>
+        <w:t>, pillow, transformers, torch, sqlite3</w:t>
       </w:r>
     </w:p>
     <w:p>
@@ -563,7 +125,15 @@
         </w:numPr>
       </w:pPr>
       <w:r>
-        <w:t>Bootstrap React frontend: npx create-react-app frontend</w:t>
+        <w:t xml:space="preserve">Bootstrap React frontend: </w:t>
+      </w:r>
+      <w:proofErr w:type="spellStart"/>
+      <w:r>
+        <w:t>npx</w:t>
+      </w:r>
+      <w:proofErr w:type="spellEnd"/>
+      <w:r>
+        <w:t xml:space="preserve"> create-react-app frontend</w:t>
       </w:r>
     </w:p>
     <w:p>
@@ -583,7 +153,23 @@
         </w:numPr>
       </w:pPr>
       <w:r>
-        <w:t>Download linkanjarad/plant-disease-model from Hugging Face (PlantVillage trained)</w:t>
+        <w:t xml:space="preserve">Download </w:t>
+      </w:r>
+      <w:proofErr w:type="spellStart"/>
+      <w:r>
+        <w:t>linkanjarad</w:t>
+      </w:r>
+      <w:proofErr w:type="spellEnd"/>
+      <w:r>
+        <w:t>/plant-disease-model from Hugging Face (</w:t>
+      </w:r>
+      <w:proofErr w:type="spellStart"/>
+      <w:r>
+        <w:t>PlantVillage</w:t>
+      </w:r>
+      <w:proofErr w:type="spellEnd"/>
+      <w:r>
+        <w:t xml:space="preserve"> trained)</w:t>
       </w:r>
     </w:p>
     <w:p>
@@ -636,7 +222,15 @@
         </w:numPr>
       </w:pPr>
       <w:r>
-        <w:t>Build PestDetection.jsx — image upload, preview, result card</w:t>
+        <w:t xml:space="preserve">Build </w:t>
+      </w:r>
+      <w:proofErr w:type="spellStart"/>
+      <w:r>
+        <w:t>PestDetection.jsx</w:t>
+      </w:r>
+      <w:proofErr w:type="spellEnd"/>
+      <w:r>
+        <w:t xml:space="preserve"> — image upload, preview, result card</w:t>
       </w:r>
     </w:p>
     <w:p>
@@ -695,7 +289,7 @@
     <w:p>
       <w:r>
         <w:pict w14:anchorId="49C95BAA">
-          <v:rect id="_x0000_i1076" style="width:0;height:1.5pt" o:hralign="center" o:hrstd="t" o:hr="t" fillcolor="#a0a0a0" stroked="f"/>
+          <v:rect id="_x0000_i1028" style="width:0;height:1.5pt" o:hralign="center" o:hrstd="t" o:hr="t" fillcolor="#a0a0a0" stroked="f"/>
         </w:pict>
       </w:r>
     </w:p>
@@ -731,7 +325,20 @@
         </w:numPr>
       </w:pPr>
       <w:r>
-        <w:t>Build crop_soil_map.json — maps soil type + state/region → suitable crops with expected yield &amp; profit</w:t>
+        <w:t xml:space="preserve">Build </w:t>
+      </w:r>
+      <w:proofErr w:type="spellStart"/>
+      <w:r>
+        <w:t>crop_soil_</w:t>
+      </w:r>
+      <w:proofErr w:type="gramStart"/>
+      <w:r>
+        <w:t>map.json</w:t>
+      </w:r>
+      <w:proofErr w:type="spellEnd"/>
+      <w:proofErr w:type="gramEnd"/>
+      <w:r>
+        <w:t xml:space="preserve"> — maps soil type + state/region → suitable crops with expected yield &amp; profit</w:t>
       </w:r>
     </w:p>
     <w:p>
@@ -764,7 +371,6 @@
         </w:numPr>
       </w:pPr>
       <w:r>
-        <w:lastRenderedPageBreak/>
         <w:t>Output: top 3 crop suggestions with estimated profit per acre</w:t>
       </w:r>
     </w:p>
@@ -785,7 +391,15 @@
         </w:numPr>
       </w:pPr>
       <w:r>
-        <w:t>Integrate Open-Meteo API (no key needed)</w:t>
+        <w:t>Integrate Open-</w:t>
+      </w:r>
+      <w:proofErr w:type="spellStart"/>
+      <w:r>
+        <w:t>Meteo</w:t>
+      </w:r>
+      <w:proofErr w:type="spellEnd"/>
+      <w:r>
+        <w:t xml:space="preserve"> API (no key needed)</w:t>
       </w:r>
     </w:p>
     <w:p>
@@ -796,7 +410,16 @@
         </w:numPr>
       </w:pPr>
       <w:r>
-        <w:t>Implement FAO-56 formula: Water needed = ETo × Kc - rainfall</w:t>
+        <w:lastRenderedPageBreak/>
+        <w:t xml:space="preserve">Implement FAO-56 formula: Water needed = </w:t>
+      </w:r>
+      <w:proofErr w:type="spellStart"/>
+      <w:r>
+        <w:t>ETo</w:t>
+      </w:r>
+      <w:proofErr w:type="spellEnd"/>
+      <w:r>
+        <w:t xml:space="preserve"> × Kc - rainfall</w:t>
       </w:r>
     </w:p>
     <w:p>
@@ -849,7 +472,15 @@
         </w:numPr>
       </w:pPr>
       <w:r>
-        <w:t>Download historical crop price data from data.gov.in (Agmarknet)</w:t>
+        <w:t>Download historical crop price data from data.gov.in (</w:t>
+      </w:r>
+      <w:proofErr w:type="spellStart"/>
+      <w:r>
+        <w:t>Agmarknet</w:t>
+      </w:r>
+      <w:proofErr w:type="spellEnd"/>
+      <w:r>
+        <w:t>)</w:t>
       </w:r>
     </w:p>
     <w:p>
@@ -882,8 +513,13 @@
         </w:numPr>
       </w:pPr>
       <w:r>
-        <w:t>Save model as market_model.pkl</w:t>
-      </w:r>
+        <w:t xml:space="preserve">Save model as </w:t>
+      </w:r>
+      <w:proofErr w:type="spellStart"/>
+      <w:r>
+        <w:t>market_model.pkl</w:t>
+      </w:r>
+      <w:proofErr w:type="spellEnd"/>
     </w:p>
     <w:p>
       <w:pPr>
@@ -913,7 +549,23 @@
         </w:numPr>
       </w:pPr>
       <w:r>
-        <w:t>Build CropAdvisor.jsx and Irrigation.jsx pages</w:t>
+        <w:t xml:space="preserve">Build </w:t>
+      </w:r>
+      <w:proofErr w:type="spellStart"/>
+      <w:r>
+        <w:t>CropAdvisor.jsx</w:t>
+      </w:r>
+      <w:proofErr w:type="spellEnd"/>
+      <w:r>
+        <w:t xml:space="preserve"> and </w:t>
+      </w:r>
+      <w:proofErr w:type="spellStart"/>
+      <w:r>
+        <w:t>Irrigation.jsx</w:t>
+      </w:r>
+      <w:proofErr w:type="spellEnd"/>
+      <w:r>
+        <w:t xml:space="preserve"> pages</w:t>
       </w:r>
     </w:p>
     <w:p>
@@ -930,7 +582,7 @@
     <w:p>
       <w:r>
         <w:pict w14:anchorId="4CCE6931">
-          <v:rect id="_x0000_i1077" style="width:0;height:1.5pt" o:hralign="center" o:hrstd="t" o:hr="t" fillcolor="#a0a0a0" stroked="f"/>
+          <v:rect id="_x0000_i1029" style="width:0;height:1.5pt" o:hralign="center" o:hrstd="t" o:hr="t" fillcolor="#a0a0a0" stroked="f"/>
         </w:pict>
       </w:r>
     </w:p>
@@ -966,7 +618,15 @@
         </w:numPr>
       </w:pPr>
       <w:r>
-        <w:t>Build Dashboard.jsx — single page showing summary of all 4 modules</w:t>
+        <w:t xml:space="preserve">Build </w:t>
+      </w:r>
+      <w:proofErr w:type="spellStart"/>
+      <w:r>
+        <w:t>Dashboard.jsx</w:t>
+      </w:r>
+      <w:proofErr w:type="spellEnd"/>
+      <w:r>
+        <w:t xml:space="preserve"> — single page showing summary of all 4 modules</w:t>
       </w:r>
     </w:p>
     <w:p>
@@ -1092,7 +752,6 @@
         </w:numPr>
       </w:pPr>
       <w:r>
-        <w:lastRenderedPageBreak/>
         <w:t>Screenshots</w:t>
       </w:r>
     </w:p>
@@ -1120,8 +779,9 @@
     </w:p>
     <w:p>
       <w:r>
+        <w:lastRenderedPageBreak/>
         <w:pict w14:anchorId="25A64DE0">
-          <v:rect id="_x0000_i1078" style="width:0;height:1.5pt" o:hralign="center" o:hrstd="t" o:hr="t" fillcolor="#a0a0a0" stroked="f"/>
+          <v:rect id="_x0000_i1030" style="width:0;height:1.5pt" o:hralign="center" o:hrstd="t" o:hr="t" fillcolor="#a0a0a0" stroked="f"/>
         </w:pict>
       </w:r>
     </w:p>
@@ -1230,8 +890,13 @@
           </w:tcPr>
           <w:p>
             <w:r>
-              <w:t>data.gov.in → Agmarknet</w:t>
+              <w:t xml:space="preserve">data.gov.in → </w:t>
             </w:r>
+            <w:proofErr w:type="spellStart"/>
+            <w:r>
+              <w:t>Agmarknet</w:t>
+            </w:r>
+            <w:proofErr w:type="spellEnd"/>
           </w:p>
         </w:tc>
       </w:tr>
@@ -1317,8 +982,13 @@
           </w:tcPr>
           <w:p>
             <w:r>
-              <w:t>Hugging Face — PlantVillage</w:t>
+              <w:t xml:space="preserve">Hugging Face — </w:t>
             </w:r>
+            <w:proofErr w:type="spellStart"/>
+            <w:r>
+              <w:t>PlantVillage</w:t>
+            </w:r>
+            <w:proofErr w:type="spellEnd"/>
           </w:p>
         </w:tc>
       </w:tr>
@@ -1355,7 +1025,7 @@
     <w:p>
       <w:r>
         <w:pict w14:anchorId="78065261">
-          <v:rect id="_x0000_i1079" style="width:0;height:1.5pt" o:hralign="center" o:hrstd="t" o:hr="t" fillcolor="#a0a0a0" stroked="f"/>
+          <v:rect id="_x0000_i1031" style="width:0;height:1.5pt" o:hralign="center" o:hrstd="t" o:hr="t" fillcolor="#a0a0a0" stroked="f"/>
         </w:pict>
       </w:r>
     </w:p>
@@ -1375,8 +1045,13 @@
       </w:r>
     </w:p>
     <w:p>
-      <w:r>
-        <w:t>KrushiAI — AI-Powered Farm Advisory Platform</w:t>
+      <w:proofErr w:type="spellStart"/>
+      <w:r>
+        <w:t>KrushiAI</w:t>
+      </w:r>
+      <w:proofErr w:type="spellEnd"/>
+      <w:r>
+        <w:t xml:space="preserve"> — AI-Powered Farm Advisory Platform</w:t>
       </w:r>
     </w:p>
     <w:p>
@@ -1391,28 +1066,76 @@
     </w:p>
     <w:p>
       <w:r>
-        <w:t>• Pest detection using fine-tuned ViT model on PlantVillage dataset</w:t>
-      </w:r>
-    </w:p>
-    <w:p>
-      <w:r>
-        <w:t>• Price prediction with Random Forest trained on Agmarknet data</w:t>
-      </w:r>
-    </w:p>
-    <w:p>
-      <w:r>
-        <w:t>• Real-time weather via Open-Meteo API + FAO-56 irrigation formula</w:t>
-      </w:r>
-    </w:p>
-    <w:p>
-      <w:r>
-        <w:t>• Stack: React, FastAPI, PyTorch, scikit-learn, SQLite</w:t>
+        <w:t xml:space="preserve">• Pest detection using fine-tuned </w:t>
+      </w:r>
+      <w:proofErr w:type="spellStart"/>
+      <w:r>
+        <w:t>ViT</w:t>
+      </w:r>
+      <w:proofErr w:type="spellEnd"/>
+      <w:r>
+        <w:t xml:space="preserve"> model on </w:t>
+      </w:r>
+      <w:proofErr w:type="spellStart"/>
+      <w:r>
+        <w:t>PlantVillage</w:t>
+      </w:r>
+      <w:proofErr w:type="spellEnd"/>
+      <w:r>
+        <w:t xml:space="preserve"> dataset</w:t>
+      </w:r>
+    </w:p>
+    <w:p>
+      <w:r>
+        <w:t xml:space="preserve">• Price prediction with Random Forest trained on </w:t>
+      </w:r>
+      <w:proofErr w:type="spellStart"/>
+      <w:r>
+        <w:t>Agmarknet</w:t>
+      </w:r>
+      <w:proofErr w:type="spellEnd"/>
+      <w:r>
+        <w:t xml:space="preserve"> data</w:t>
+      </w:r>
+    </w:p>
+    <w:p>
+      <w:r>
+        <w:t>• Real-time weather via Open-</w:t>
+      </w:r>
+      <w:proofErr w:type="spellStart"/>
+      <w:r>
+        <w:t>Meteo</w:t>
+      </w:r>
+      <w:proofErr w:type="spellEnd"/>
+      <w:r>
+        <w:t xml:space="preserve"> API + FAO-56 irrigation formula</w:t>
+      </w:r>
+    </w:p>
+    <w:p>
+      <w:r>
+        <w:t xml:space="preserve">• Stack: React, </w:t>
+      </w:r>
+      <w:proofErr w:type="spellStart"/>
+      <w:r>
+        <w:t>FastAPI</w:t>
+      </w:r>
+      <w:proofErr w:type="spellEnd"/>
+      <w:r>
+        <w:t xml:space="preserve">, </w:t>
+      </w:r>
+      <w:proofErr w:type="spellStart"/>
+      <w:r>
+        <w:t>PyTorch</w:t>
+      </w:r>
+      <w:proofErr w:type="spellEnd"/>
+      <w:r>
+        <w:t>, scikit-learn, SQLite</w:t>
       </w:r>
     </w:p>
     <w:p>
       <w:r>
         <w:pict w14:anchorId="2593426F">
-          <v:rect id="_x0000_i1080" style="width:0;height:1.5pt" o:hralign="center" o:hrstd="t" o:hr="t" fillcolor="#a0a0a0" stroked="f"/>
+          <v:rect id="_x0000_i1032" style="width:0;height:1.5pt" o:hralign="center" o:hrstd="t" o:hr="t" fillcolor="#a0a0a0" stroked="f"/>
         </w:pict>
       </w:r>
     </w:p>
@@ -1440,7 +1163,15 @@
         <w:t>Start with Day 1 of Week 1</w:t>
       </w:r>
       <w:r>
-        <w:t xml:space="preserve"> — set up the project structure and get FastAPI running with a hello world endpoint. Then pest detection on Day 2.</w:t>
+        <w:t xml:space="preserve"> — set up the project structure and get </w:t>
+      </w:r>
+      <w:proofErr w:type="spellStart"/>
+      <w:r>
+        <w:t>FastAPI</w:t>
+      </w:r>
+      <w:proofErr w:type="spellEnd"/>
+      <w:r>
+        <w:t xml:space="preserve"> running with a hello world endpoint. Then pest detection on Day 2.</w:t>
       </w:r>
     </w:p>
     <w:p>
@@ -1455,7 +1186,15 @@
         <w:t>exact starter code</w:t>
       </w:r>
       <w:r>
-        <w:t xml:space="preserve"> for Day 1 setup — the FastAPI app, folder structure, and React bootstrap?</w:t>
+        <w:t xml:space="preserve"> for Day 1 setup — the </w:t>
+      </w:r>
+      <w:proofErr w:type="spellStart"/>
+      <w:r>
+        <w:t>FastAPI</w:t>
+      </w:r>
+      <w:proofErr w:type="spellEnd"/>
+      <w:r>
+        <w:t xml:space="preserve"> app, folder structure, and React bootstrap?</w:t>
       </w:r>
     </w:p>
     <w:p/>
@@ -3901,6 +3640,7 @@
   <w:style w:type="character" w:default="1" w:styleId="DefaultParagraphFont">
     <w:name w:val="Default Paragraph Font"/>
     <w:uiPriority w:val="1"/>
+    <w:semiHidden/>
     <w:unhideWhenUsed/>
   </w:style>
   <w:style w:type="table" w:default="1" w:styleId="TableNormal">

</xml_diff>

<commit_message>
Updated market price module
</commit_message>
<xml_diff>
--- a/plan.docx
+++ b/plan.docx
@@ -5,7 +5,7 @@
     <w:p>
       <w:r>
         <w:pict w14:anchorId="2A5B3CB6">
-          <v:rect id="_x0000_i1026" style="width:0;height:1.5pt" o:hralign="center" o:hrstd="t" o:hr="t" fillcolor="#a0a0a0" stroked="f"/>
+          <v:rect id="_x0000_i1025" style="width:0;height:1.5pt" o:hralign="center" o:hrstd="t" o:hr="t" fillcolor="#a0a0a0" stroked="f"/>
         </w:pict>
       </w:r>
     </w:p>
@@ -27,7 +27,7 @@
     <w:p>
       <w:r>
         <w:pict w14:anchorId="0934CDD7">
-          <v:rect id="_x0000_i1027" style="width:0;height:1.5pt" o:hralign="center" o:hrstd="t" o:hr="t" fillcolor="#a0a0a0" stroked="f"/>
+          <v:rect id="_x0000_i1026" style="width:0;height:1.5pt" o:hralign="center" o:hrstd="t" o:hr="t" fillcolor="#a0a0a0" stroked="f"/>
         </w:pict>
       </w:r>
     </w:p>
@@ -289,7 +289,7 @@
     <w:p>
       <w:r>
         <w:pict w14:anchorId="49C95BAA">
-          <v:rect id="_x0000_i1028" style="width:0;height:1.5pt" o:hralign="center" o:hrstd="t" o:hr="t" fillcolor="#a0a0a0" stroked="f"/>
+          <v:rect id="_x0000_i1027" style="width:0;height:1.5pt" o:hralign="center" o:hrstd="t" o:hr="t" fillcolor="#a0a0a0" stroked="f"/>
         </w:pict>
       </w:r>
     </w:p>
@@ -582,7 +582,7 @@
     <w:p>
       <w:r>
         <w:pict w14:anchorId="4CCE6931">
-          <v:rect id="_x0000_i1029" style="width:0;height:1.5pt" o:hralign="center" o:hrstd="t" o:hr="t" fillcolor="#a0a0a0" stroked="f"/>
+          <v:rect id="_x0000_i1028" style="width:0;height:1.5pt" o:hralign="center" o:hrstd="t" o:hr="t" fillcolor="#a0a0a0" stroked="f"/>
         </w:pict>
       </w:r>
     </w:p>
@@ -781,7 +781,7 @@
       <w:r>
         <w:lastRenderedPageBreak/>
         <w:pict w14:anchorId="25A64DE0">
-          <v:rect id="_x0000_i1030" style="width:0;height:1.5pt" o:hralign="center" o:hrstd="t" o:hr="t" fillcolor="#a0a0a0" stroked="f"/>
+          <v:rect id="_x0000_i1029" style="width:0;height:1.5pt" o:hralign="center" o:hrstd="t" o:hr="t" fillcolor="#a0a0a0" stroked="f"/>
         </w:pict>
       </w:r>
     </w:p>
@@ -1025,7 +1025,7 @@
     <w:p>
       <w:r>
         <w:pict w14:anchorId="78065261">
-          <v:rect id="_x0000_i1031" style="width:0;height:1.5pt" o:hralign="center" o:hrstd="t" o:hr="t" fillcolor="#a0a0a0" stroked="f"/>
+          <v:rect id="_x0000_i1030" style="width:0;height:1.5pt" o:hralign="center" o:hrstd="t" o:hr="t" fillcolor="#a0a0a0" stroked="f"/>
         </w:pict>
       </w:r>
     </w:p>
@@ -1135,69 +1135,10 @@
     <w:p>
       <w:r>
         <w:pict w14:anchorId="2593426F">
-          <v:rect id="_x0000_i1032" style="width:0;height:1.5pt" o:hralign="center" o:hrstd="t" o:hr="t" fillcolor="#a0a0a0" stroked="f"/>
+          <v:rect id="_x0000_i1031" style="width:0;height:1.5pt" o:hralign="center" o:hrstd="t" o:hr="t" fillcolor="#a0a0a0" stroked="f"/>
         </w:pict>
       </w:r>
     </w:p>
-    <w:p>
-      <w:pPr>
-        <w:rPr>
-          <w:b/>
-          <w:bCs/>
-        </w:rPr>
-      </w:pPr>
-      <w:r>
-        <w:rPr>
-          <w:b/>
-          <w:bCs/>
-        </w:rPr>
-        <w:t>Where to Start Right Now</w:t>
-      </w:r>
-    </w:p>
-    <w:p>
-      <w:r>
-        <w:rPr>
-          <w:b/>
-          <w:bCs/>
-        </w:rPr>
-        <w:t>Start with Day 1 of Week 1</w:t>
-      </w:r>
-      <w:r>
-        <w:t xml:space="preserve"> — set up the project structure and get </w:t>
-      </w:r>
-      <w:proofErr w:type="spellStart"/>
-      <w:r>
-        <w:t>FastAPI</w:t>
-      </w:r>
-      <w:proofErr w:type="spellEnd"/>
-      <w:r>
-        <w:t xml:space="preserve"> running with a hello world endpoint. Then pest detection on Day 2.</w:t>
-      </w:r>
-    </w:p>
-    <w:p>
-      <w:r>
-        <w:t xml:space="preserve">Want me to give you the </w:t>
-      </w:r>
-      <w:r>
-        <w:rPr>
-          <w:b/>
-          <w:bCs/>
-        </w:rPr>
-        <w:t>exact starter code</w:t>
-      </w:r>
-      <w:r>
-        <w:t xml:space="preserve"> for Day 1 setup — the </w:t>
-      </w:r>
-      <w:proofErr w:type="spellStart"/>
-      <w:r>
-        <w:t>FastAPI</w:t>
-      </w:r>
-      <w:proofErr w:type="spellEnd"/>
-      <w:r>
-        <w:t xml:space="preserve"> app, folder structure, and React bootstrap?</w:t>
-      </w:r>
-    </w:p>
-    <w:p/>
     <w:sectPr>
       <w:pgSz w:w="11906" w:h="16838"/>
       <w:pgMar w:top="1440" w:right="1440" w:bottom="1440" w:left="1440" w:header="720" w:footer="720" w:gutter="0"/>

</xml_diff>